<commit_message>
feat: preprocessing pipeline - SNV filter, one hot encoding, stratified splits
</commit_message>
<xml_diff>
--- a/ClinVar.docx
+++ b/ClinVar.docx
@@ -3,54 +3,20 @@
 <w:document xmlns:wpc="http://schemas.microsoft.com/office/word/2010/wordprocessingCanvas" xmlns:cx="http://schemas.microsoft.com/office/drawing/2014/chartex" xmlns:cx1="http://schemas.microsoft.com/office/drawing/2015/9/8/chartex" xmlns:cx2="http://schemas.microsoft.com/office/drawing/2015/10/21/chartex" xmlns:cx3="http://schemas.microsoft.com/office/drawing/2016/5/9/chartex" xmlns:cx4="http://schemas.microsoft.com/office/drawing/2016/5/10/chartex" xmlns:cx5="http://schemas.microsoft.com/office/drawing/2016/5/11/chartex" xmlns:cx6="http://schemas.microsoft.com/office/drawing/2016/5/12/chartex" xmlns:cx7="http://schemas.microsoft.com/office/drawing/2016/5/13/chartex" xmlns:cx8="http://schemas.microsoft.com/office/drawing/2016/5/14/chartex" xmlns:mc="http://schemas.openxmlformats.org/markup-compatibility/2006" xmlns:aink="http://schemas.microsoft.com/office/drawing/2016/ink" xmlns:am3d="http://schemas.microsoft.com/office/drawing/2017/model3d" xmlns:o="urn:schemas-microsoft-com:office:office" xmlns:oel="http://schemas.microsoft.com/office/2019/extlst" xmlns:r="http://schemas.openxmlformats.org/officeDocument/2006/relationships" xmlns:m="http://schemas.openxmlformats.org/officeDocument/2006/math" xmlns:v="urn:schemas-microsoft-com:vml" xmlns:wp14="http://schemas.microsoft.com/office/word/2010/wordprocessingDrawing" xmlns:wp="http://schemas.openxmlformats.org/drawingml/2006/wordprocessingDrawing" xmlns:w10="urn:schemas-microsoft-com:office:word" xmlns:w="http://schemas.openxmlformats.org/wordprocessingml/2006/main" xmlns:w14="http://schemas.microsoft.com/office/word/2010/wordml" xmlns:w15="http://schemas.microsoft.com/office/word/2012/wordml" xmlns:w16cex="http://schemas.microsoft.com/office/word/2018/wordml/cex" xmlns:w16cid="http://schemas.microsoft.com/office/word/2016/wordml/cid" xmlns:w16="http://schemas.microsoft.com/office/word/2018/wordml" xmlns:w16du="http://schemas.microsoft.com/office/word/2023/wordml/word16du" xmlns:w16sdtdh="http://schemas.microsoft.com/office/word/2020/wordml/sdtdatahash" xmlns:w16sdtfl="http://schemas.microsoft.com/office/word/2024/wordml/sdtformatlock" xmlns:w16se="http://schemas.microsoft.com/office/word/2015/wordml/symex" xmlns:wpg="http://schemas.microsoft.com/office/word/2010/wordprocessingGroup" xmlns:wpi="http://schemas.microsoft.com/office/word/2010/wordprocessingInk" xmlns:wne="http://schemas.microsoft.com/office/word/2006/wordml" xmlns:wps="http://schemas.microsoft.com/office/word/2010/wordprocessingShape" mc:Ignorable="w14 w15 w16se w16cid w16 w16cex w16sdtdh w16sdtfl w16du wp14">
   <w:body>
     <w:p>
-      <w:proofErr w:type="spellStart"/>
       <w:r>
         <w:t>ClinVar</w:t>
-      </w:r>
-      <w:proofErr w:type="spellEnd"/>
-    </w:p>
-    <w:p/>
-    <w:p>
-      <w:r>
-        <w:t xml:space="preserve">I built a pathogenic variant classifier on </w:t>
-      </w:r>
-      <w:proofErr w:type="spellStart"/>
-      <w:r>
-        <w:t>ClinVar</w:t>
-      </w:r>
-      <w:proofErr w:type="spellEnd"/>
-      <w:r>
-        <w:t xml:space="preserve"> — that was deliberately chosen to give me fluency with real VCF data, class imbalance in genomic settings, and confounder auditing before I moved to my dissertation. My dissertation used TCGA and 1000 Genomes to demonstrate that models trained on predominantly European-ancestry cohorts degrade on other populations, then applied adversarial </w:t>
-      </w:r>
-      <w:proofErr w:type="spellStart"/>
-      <w:r>
-        <w:t>deconfounding</w:t>
-      </w:r>
-      <w:proofErr w:type="spellEnd"/>
-      <w:r>
-        <w:t xml:space="preserve"> to correct for it. The </w:t>
-      </w:r>
-      <w:proofErr w:type="spellStart"/>
-      <w:r>
-        <w:t>ClinVar</w:t>
-      </w:r>
-      <w:proofErr w:type="spellEnd"/>
-      <w:r>
-        <w:t xml:space="preserve"> project was designed so the pipeline and tooling transferred directly — I wasn't starting from scratch in Year 3."</w:t>
       </w:r>
     </w:p>
     <w:p/>
     <w:p>
       <w:r>
-        <w:t xml:space="preserve">"While building the </w:t>
+        <w:t>I built a pathogenic variant classifier on ClinVar — that was deliberately chosen to give me fluency with real VCF data, class imbalance in genomic settings, and confounder auditing before I moved to my dissertation. My dissertation used TCGA and 1000 Genomes to demonstrate that models trained on predominantly European-ancestry cohorts degrade on other populations, then applied adversarial deconfounding to correct for it. The ClinVar project was designed so the pipeline and tooling transferred directly — I wasn't starting from scratch in Year 3."</w:t>
       </w:r>
-      <w:proofErr w:type="spellStart"/>
+    </w:p>
+    <w:p/>
+    <w:p>
       <w:r>
-        <w:t>ClinVar</w:t>
-      </w:r>
-      <w:proofErr w:type="spellEnd"/>
-      <w:r>
-        <w:t xml:space="preserve"> classifier, I audited the dataset for confounders and found that the training data is heavily skewed toward well-studied genes and — critically — toward variants discovered in European-ancestry cohorts. My model performs well on the test set, but the test set has the same bias as the training set. This raised the question: what happens when you deploy a model like this on a population that wasn't represented in training? That question directly motivated my dissertation."</w:t>
+        <w:t>"While building the ClinVar classifier, I audited the dataset for confounders and found that the training data is heavily skewed toward well-studied genes and — critically — toward variants discovered in European-ancestry cohorts. My model performs well on the test set, but the test set has the same bias as the training set. This raised the question: what happens when you deploy a model like this on a population that wasn't represented in training? That question directly motivated my dissertation."</w:t>
       </w:r>
     </w:p>
     <w:p/>
@@ -63,6 +29,43 @@
     <w:p>
       <w:r>
         <w:t>"The eGFR case demonstrates that any quantitative clinical tool — formula or model — can encode population bias with real patient harm consequences. As clinical decision-making moves toward ML-based genomic tools, the same failure mode applies at greater scale and with less transparency."</w:t>
+      </w:r>
+    </w:p>
+    <w:p/>
+    <w:p>
+      <w:r>
+        <w:rPr>
+          <w:b/>
+          <w:bCs/>
+        </w:rPr>
+        <w:t>## Future Work — ClinVar Stage</w:t>
+      </w:r>
+      <w:r>
+        <w:t xml:space="preserve"> </w:t>
+      </w:r>
+      <w:r>
+        <w:rPr>
+          <w:b/>
+          <w:bCs/>
+        </w:rPr>
+        <w:t>### 1. Richer sequence encoding</w:t>
+      </w:r>
+      <w:r>
+        <w:t xml:space="preserve"> Current model encodes only the mutated base pair (ref→alt) as an 8-dimensional one-hot vector. This loses positional context — the same C→T mutation can be pathogenic at one position and benign at another depending on surrounding sequence. Future improvement: encode flanking sequence context (e.g. 50-100 bases either side of the variant) as a longer one-hot matrix. This is standard in production genomic models and directly motivates the use of DNABERT/Nucleotide Transformer in Year 3, which are pretrained on exactly this kind of contextual sequence representation. </w:t>
+      </w:r>
+      <w:r>
+        <w:rPr>
+          <w:b/>
+          <w:bCs/>
+        </w:rPr>
+        <w:t>### 2. Non-SNV variant encoding</w:t>
+      </w:r>
+      <w:r>
+        <w:t xml:space="preserve"> Current model excludes indels, deletions, duplications (10.9% of filtered dataset) due to variable length encoding complexity. Future improvement: pad variable length alleles to a fixed maximum length, or use a recurrent/attention architecture that handles variable length input natively. Structural variants show stronger population frequency differences across ancestry groups than SNVs — including them would likely strengthen the deconfounding argument in Year 3. Core dissertation </w:t>
+      </w:r>
+      <w:r>
+        <w:lastRenderedPageBreak/>
+        <w:t>argument this supports: "This study establishes a conservative lower bound on population stratification effects. Even for SNVs — the most stable variant class — population bias is significant enough to require deconfounding. The problem is almost certainly worse when structural variants are included."</w:t>
       </w:r>
     </w:p>
     <w:sectPr>

</xml_diff>